<commit_message>
adding pdf files and word files of the physical menu
</commit_message>
<xml_diff>
--- a/mongo_menu_pics/Genghis Khan Mongolian.docx
+++ b/mongo_menu_pics/Genghis Khan Mongolian.docx
@@ -5,71 +5,7 @@
   <w:body>
     <w:p>
       <w:pPr>
-        <w:jc w:val="center"/>
-        <w:rPr>
-          <w:rFonts w:ascii="Felix Titling" w:hAnsi="Felix Titling"/>
-          <w:b/>
-          <w:color w:val="8B0000"/>
-          <w:spacing w:val="10"/>
-          <w:sz w:val="28"/>
-          <w:szCs w:val="28"/>
-          <w14:shadow w14:blurRad="63500" w14:dist="50800" w14:dir="13500000" w14:sx="0" w14:sy="0" w14:kx="0" w14:ky="0" w14:algn="none">
-            <w14:srgbClr w14:val="000000">
-              <w14:alpha w14:val="50000"/>
-            </w14:srgbClr>
-          </w14:shadow>
-          <w14:textOutline w14:w="0" w14:cap="flat" w14:cmpd="sng" w14:algn="ctr">
-            <w14:noFill/>
-            <w14:prstDash w14:val="solid"/>
-            <w14:round/>
-          </w14:textOutline>
-        </w:rPr>
-      </w:pPr>
-      <w:r>
-        <w:rPr>
-          <w:rFonts w:ascii="Felix Titling" w:hAnsi="Felix Titling"/>
-          <w:b/>
-          <w:color w:val="8B0000"/>
-          <w:spacing w:val="10"/>
-          <w:sz w:val="28"/>
-          <w:szCs w:val="28"/>
-          <w14:shadow w14:blurRad="63500" w14:dist="50800" w14:dir="13500000" w14:sx="0" w14:sy="0" w14:kx="0" w14:ky="0" w14:algn="none">
-            <w14:srgbClr w14:val="000000">
-              <w14:alpha w14:val="50000"/>
-            </w14:srgbClr>
-          </w14:shadow>
-          <w14:textOutline w14:w="0" w14:cap="flat" w14:cmpd="sng" w14:algn="ctr">
-            <w14:noFill/>
-            <w14:prstDash w14:val="solid"/>
-            <w14:round/>
-          </w14:textOutline>
-        </w:rPr>
-        <w:t xml:space="preserve">Genghis Khan </w:t>
-      </w:r>
-      <w:r>
-        <w:rPr>
-          <w:rFonts w:ascii="Felix Titling" w:hAnsi="Felix Titling"/>
-          <w:b/>
-          <w:color w:val="8B0000"/>
-          <w:spacing w:val="10"/>
-          <w:sz w:val="28"/>
-          <w:szCs w:val="28"/>
-          <w14:shadow w14:blurRad="63500" w14:dist="50800" w14:dir="13500000" w14:sx="0" w14:sy="0" w14:kx="0" w14:ky="0" w14:algn="none">
-            <w14:srgbClr w14:val="000000">
-              <w14:alpha w14:val="50000"/>
-            </w14:srgbClr>
-          </w14:shadow>
-          <w14:textOutline w14:w="0" w14:cap="flat" w14:cmpd="sng" w14:algn="ctr">
-            <w14:noFill/>
-            <w14:prstDash w14:val="solid"/>
-            <w14:round/>
-          </w14:textOutline>
-        </w:rPr>
-        <w:t xml:space="preserve">Mongolian </w:t>
-      </w:r>
-    </w:p>
-    <w:p>
-      <w:pPr>
+        <w:spacing w:after="0"/>
         <w:jc w:val="center"/>
         <w:rPr>
           <w:rFonts w:ascii="Felix Titling" w:hAnsi="Felix Titling"/>
@@ -111,10 +47,82 @@
             <w14:round/>
           </w14:textOutline>
         </w:rPr>
+        <w:t xml:space="preserve">Genghis Khan </w:t>
+      </w:r>
+      <w:r>
+        <w:rPr>
+          <w:rFonts w:ascii="Felix Titling" w:hAnsi="Felix Titling"/>
+          <w:b/>
+          <w:color w:val="8B0000"/>
+          <w:spacing w:val="10"/>
+          <w:sz w:val="28"/>
+          <w:szCs w:val="28"/>
+          <w:u w:val="single"/>
+          <w14:shadow w14:blurRad="63500" w14:dist="50800" w14:dir="13500000" w14:sx="0" w14:sy="0" w14:kx="0" w14:ky="0" w14:algn="none">
+            <w14:srgbClr w14:val="000000">
+              <w14:alpha w14:val="50000"/>
+            </w14:srgbClr>
+          </w14:shadow>
+          <w14:textOutline w14:w="0" w14:cap="flat" w14:cmpd="sng" w14:algn="ctr">
+            <w14:noFill/>
+            <w14:prstDash w14:val="solid"/>
+            <w14:round/>
+          </w14:textOutline>
+        </w:rPr>
+        <w:t>Mongolian</w:t>
+      </w:r>
+    </w:p>
+    <w:p>
+      <w:pPr>
+        <w:spacing w:after="0"/>
+        <w:jc w:val="center"/>
+        <w:rPr>
+          <w:rFonts w:ascii="Felix Titling" w:hAnsi="Felix Titling"/>
+          <w:b/>
+          <w:color w:val="8B0000"/>
+          <w:spacing w:val="10"/>
+          <w:sz w:val="28"/>
+          <w:szCs w:val="28"/>
+          <w:u w:val="single"/>
+          <w14:shadow w14:blurRad="63500" w14:dist="50800" w14:dir="13500000" w14:sx="0" w14:sy="0" w14:kx="0" w14:ky="0" w14:algn="none">
+            <w14:srgbClr w14:val="000000">
+              <w14:alpha w14:val="50000"/>
+            </w14:srgbClr>
+          </w14:shadow>
+          <w14:textOutline w14:w="0" w14:cap="flat" w14:cmpd="sng" w14:algn="ctr">
+            <w14:noFill/>
+            <w14:prstDash w14:val="solid"/>
+            <w14:round/>
+          </w14:textOutline>
+        </w:rPr>
+      </w:pPr>
+      <w:r>
+        <w:rPr>
+          <w:rFonts w:ascii="Felix Titling" w:hAnsi="Felix Titling"/>
+          <w:b/>
+          <w:color w:val="8B0000"/>
+          <w:spacing w:val="10"/>
+          <w:sz w:val="28"/>
+          <w:szCs w:val="28"/>
+          <w:u w:val="single"/>
+          <w14:shadow w14:blurRad="63500" w14:dist="50800" w14:dir="13500000" w14:sx="0" w14:sy="0" w14:kx="0" w14:ky="0" w14:algn="none">
+            <w14:srgbClr w14:val="000000">
+              <w14:alpha w14:val="50000"/>
+            </w14:srgbClr>
+          </w14:shadow>
+          <w14:textOutline w14:w="0" w14:cap="flat" w14:cmpd="sng" w14:algn="ctr">
+            <w14:noFill/>
+            <w14:prstDash w14:val="solid"/>
+            <w14:round/>
+          </w14:textOutline>
+        </w:rPr>
         <w:t>Drink Menu</w:t>
       </w:r>
     </w:p>
     <w:p>
+      <w:pPr>
+        <w:spacing w:after="0"/>
+      </w:pPr>
       <w:r>
         <w:rPr>
           <w:noProof/>
@@ -145,7 +153,7 @@
                     </pic:cNvPicPr>
                   </pic:nvPicPr>
                   <pic:blipFill>
-                    <a:blip r:embed="rId6" cstate="print">
+                    <a:blip r:embed="rId8" cstate="print">
                       <a:extLst>
                         <a:ext uri="{28A0092B-C50C-407E-A947-70E740481C1C}">
                           <a14:useLocalDpi xmlns:a14="http://schemas.microsoft.com/office/drawing/2010/main" val="0"/>
@@ -186,23 +194,33 @@
     <w:p/>
     <w:p/>
     <w:p/>
-    <w:p/>
-    <w:p/>
+    <w:p>
+      <w:pPr>
+        <w:spacing w:after="120"/>
+      </w:pPr>
+    </w:p>
+    <w:p>
+      <w:pPr>
+        <w:spacing w:after="120"/>
+      </w:pPr>
+    </w:p>
     <w:p>
       <w:pPr>
         <w:jc w:val="center"/>
         <w:rPr>
-          <w:color w:val="8B0000"/>
-          <w:sz w:val="40"/>
-          <w:szCs w:val="40"/>
+          <w:rFonts w:ascii="Algerian" w:hAnsi="Algerian"/>
+          <w:color w:val="8B0000"/>
+          <w:sz w:val="32"/>
+          <w:szCs w:val="32"/>
           <w:u w:val="single"/>
         </w:rPr>
       </w:pPr>
       <w:r>
         <w:rPr>
-          <w:color w:val="8B0000"/>
-          <w:sz w:val="40"/>
-          <w:szCs w:val="40"/>
+          <w:rFonts w:ascii="Algerian" w:hAnsi="Algerian"/>
+          <w:color w:val="8B0000"/>
+          <w:sz w:val="32"/>
+          <w:szCs w:val="32"/>
           <w:u w:val="single"/>
         </w:rPr>
         <w:t>Daily Specials</w:t>
@@ -213,272 +231,630 @@
         <w:spacing w:after="20"/>
         <w:rPr>
           <w:color w:val="8B0000"/>
-        </w:rPr>
-      </w:pPr>
-      <w:r>
-        <w:rPr>
-          <w:color w:val="8B0000"/>
+          <w:sz w:val="22"/>
+          <w:szCs w:val="22"/>
+        </w:rPr>
+      </w:pPr>
+      <w:r>
+        <w:rPr>
+          <w:color w:val="8B0000"/>
+          <w:sz w:val="22"/>
+          <w:szCs w:val="22"/>
+        </w:rPr>
+        <w:t>Wednesday</w:t>
+      </w:r>
+      <w:r>
+        <w:rPr>
+          <w:color w:val="8B0000"/>
+          <w:sz w:val="22"/>
+          <w:szCs w:val="22"/>
+        </w:rPr>
+        <w:t xml:space="preserve">: </w:t>
+      </w:r>
+      <w:r>
+        <w:rPr>
+          <w:color w:val="8B0000"/>
+          <w:sz w:val="22"/>
+          <w:szCs w:val="22"/>
+        </w:rPr>
+        <w:t>(Kids eat Free Under 11)</w:t>
+      </w:r>
+    </w:p>
+    <w:p>
+      <w:pPr>
+        <w:spacing w:after="20"/>
+        <w:rPr>
+          <w:color w:val="8B0000"/>
+          <w:sz w:val="22"/>
+          <w:szCs w:val="22"/>
+        </w:rPr>
+      </w:pPr>
+      <w:r>
+        <w:rPr>
+          <w:color w:val="8B0000"/>
+          <w:sz w:val="22"/>
+          <w:szCs w:val="22"/>
+        </w:rPr>
+        <w:tab/>
+      </w:r>
+      <w:r>
+        <w:rPr>
+          <w:rFonts w:ascii="Algerian" w:hAnsi="Algerian"/>
+          <w:color w:val="8B0000"/>
+          <w:sz w:val="22"/>
+          <w:szCs w:val="22"/>
+        </w:rPr>
+        <w:t>*</w:t>
+      </w:r>
+      <w:r>
+        <w:rPr>
+          <w:rFonts w:ascii="Algerian" w:hAnsi="Algerian"/>
+          <w:color w:val="8B0000"/>
+          <w:sz w:val="22"/>
+          <w:szCs w:val="22"/>
+        </w:rPr>
+        <w:t>Margaritas</w:t>
+      </w:r>
+      <w:r>
+        <w:rPr>
+          <w:color w:val="8B0000"/>
+          <w:sz w:val="22"/>
+          <w:szCs w:val="22"/>
+        </w:rPr>
+        <w:tab/>
+      </w:r>
+      <w:r>
+        <w:rPr>
+          <w:color w:val="8B0000"/>
+          <w:sz w:val="22"/>
+          <w:szCs w:val="22"/>
+        </w:rPr>
+        <w:tab/>
+      </w:r>
+      <w:r>
+        <w:rPr>
+          <w:color w:val="8B0000"/>
+          <w:sz w:val="22"/>
+          <w:szCs w:val="22"/>
+        </w:rPr>
+        <w:tab/>
+      </w:r>
+      <w:r>
+        <w:rPr>
+          <w:color w:val="8B0000"/>
+          <w:sz w:val="22"/>
+          <w:szCs w:val="22"/>
+        </w:rPr>
+        <w:t>$6.25</w:t>
+      </w:r>
+    </w:p>
+    <w:p>
+      <w:pPr>
+        <w:spacing w:after="20"/>
+        <w:rPr>
+          <w:color w:val="8B0000"/>
+          <w:sz w:val="22"/>
+          <w:szCs w:val="22"/>
+        </w:rPr>
+      </w:pPr>
+      <w:r>
+        <w:rPr>
+          <w:color w:val="8B0000"/>
+          <w:sz w:val="22"/>
+          <w:szCs w:val="22"/>
+        </w:rPr>
+        <w:t>Thursday</w:t>
+      </w:r>
+      <w:r>
+        <w:rPr>
+          <w:color w:val="8B0000"/>
+          <w:sz w:val="22"/>
+          <w:szCs w:val="22"/>
+        </w:rPr>
+        <w:t>:</w:t>
+      </w:r>
+    </w:p>
+    <w:p>
+      <w:pPr>
+        <w:spacing w:after="20"/>
+        <w:rPr>
+          <w:color w:val="8B0000"/>
+          <w:sz w:val="22"/>
+          <w:szCs w:val="22"/>
+        </w:rPr>
+      </w:pPr>
+      <w:r>
+        <w:rPr>
+          <w:color w:val="8B0000"/>
+          <w:sz w:val="22"/>
+          <w:szCs w:val="22"/>
+        </w:rPr>
+        <w:tab/>
+      </w:r>
+      <w:r>
+        <w:rPr>
+          <w:rFonts w:ascii="Algerian" w:hAnsi="Algerian"/>
+          <w:color w:val="8B0000"/>
+          <w:sz w:val="22"/>
+          <w:szCs w:val="22"/>
+        </w:rPr>
+        <w:t>*</w:t>
+      </w:r>
+      <w:r>
+        <w:rPr>
+          <w:rFonts w:ascii="Algerian" w:hAnsi="Algerian"/>
+          <w:color w:val="8B0000"/>
+          <w:sz w:val="22"/>
+          <w:szCs w:val="22"/>
+        </w:rPr>
+        <w:t>Long Island Ice</w:t>
+      </w:r>
+      <w:r>
+        <w:rPr>
+          <w:rFonts w:ascii="Algerian" w:hAnsi="Algerian"/>
+          <w:color w:val="8B0000"/>
+          <w:sz w:val="22"/>
+          <w:szCs w:val="22"/>
+        </w:rPr>
+        <w:t>d</w:t>
+      </w:r>
+      <w:r>
+        <w:rPr>
+          <w:rFonts w:ascii="Algerian" w:hAnsi="Algerian"/>
+          <w:color w:val="8B0000"/>
+          <w:sz w:val="22"/>
+          <w:szCs w:val="22"/>
+        </w:rPr>
+        <w:t xml:space="preserve"> Tea</w:t>
+      </w:r>
+      <w:r>
+        <w:rPr>
+          <w:rFonts w:ascii="Algerian" w:hAnsi="Algerian"/>
+          <w:color w:val="8B0000"/>
+          <w:sz w:val="22"/>
+          <w:szCs w:val="22"/>
+        </w:rPr>
+        <w:tab/>
+      </w:r>
+      <w:r>
+        <w:rPr>
+          <w:color w:val="8B0000"/>
+          <w:sz w:val="22"/>
+          <w:szCs w:val="22"/>
+        </w:rPr>
+        <w:tab/>
+      </w:r>
+      <w:r>
+        <w:rPr>
+          <w:color w:val="8B0000"/>
+          <w:sz w:val="22"/>
+          <w:szCs w:val="22"/>
+        </w:rPr>
+        <w:t>$6.25</w:t>
+      </w:r>
+    </w:p>
+    <w:p>
+      <w:pPr>
+        <w:spacing w:after="20"/>
+        <w:rPr>
+          <w:color w:val="8B0000"/>
+          <w:sz w:val="22"/>
+          <w:szCs w:val="22"/>
+        </w:rPr>
+      </w:pPr>
+      <w:r>
+        <w:rPr>
+          <w:color w:val="8B0000"/>
+          <w:sz w:val="22"/>
+          <w:szCs w:val="22"/>
+        </w:rPr>
+        <w:t>Friday</w:t>
+      </w:r>
+      <w:r>
+        <w:rPr>
+          <w:color w:val="8B0000"/>
+          <w:sz w:val="22"/>
+          <w:szCs w:val="22"/>
+        </w:rPr>
+        <w:t xml:space="preserve">: </w:t>
+      </w:r>
+      <w:r>
+        <w:rPr>
+          <w:color w:val="8B0000"/>
+          <w:sz w:val="22"/>
+          <w:szCs w:val="22"/>
+        </w:rPr>
+        <w:t>(Bottles)</w:t>
+      </w:r>
+    </w:p>
+    <w:p>
+      <w:pPr>
+        <w:spacing w:after="20"/>
+        <w:rPr>
+          <w:color w:val="8B0000"/>
+          <w:sz w:val="22"/>
+          <w:szCs w:val="22"/>
+        </w:rPr>
+      </w:pPr>
+      <w:r>
+        <w:rPr>
+          <w:color w:val="8B0000"/>
+          <w:sz w:val="22"/>
+          <w:szCs w:val="22"/>
+        </w:rPr>
+        <w:tab/>
+      </w:r>
+      <w:r>
+        <w:rPr>
+          <w:rFonts w:ascii="Algerian" w:hAnsi="Algerian"/>
+          <w:color w:val="8B0000"/>
+          <w:sz w:val="22"/>
+          <w:szCs w:val="22"/>
+        </w:rPr>
+        <w:t>*</w:t>
+      </w:r>
+      <w:r>
+        <w:rPr>
+          <w:rFonts w:ascii="Algerian" w:hAnsi="Algerian"/>
+          <w:color w:val="8B0000"/>
+          <w:sz w:val="22"/>
+          <w:szCs w:val="22"/>
+        </w:rPr>
+        <w:t>Budweiser &amp; Bud Light</w:t>
+      </w:r>
+      <w:r>
+        <w:rPr>
+          <w:color w:val="8B0000"/>
+          <w:sz w:val="22"/>
+          <w:szCs w:val="22"/>
+        </w:rPr>
+        <w:tab/>
+      </w:r>
+      <w:r>
+        <w:rPr>
+          <w:color w:val="8B0000"/>
+          <w:sz w:val="22"/>
+          <w:szCs w:val="22"/>
+        </w:rPr>
+        <w:tab/>
+      </w:r>
+      <w:r>
+        <w:rPr>
+          <w:color w:val="8B0000"/>
+          <w:sz w:val="22"/>
+          <w:szCs w:val="22"/>
+        </w:rPr>
+        <w:t>$</w:t>
+      </w:r>
+      <w:r>
+        <w:rPr>
+          <w:color w:val="8B0000"/>
+          <w:sz w:val="22"/>
+          <w:szCs w:val="22"/>
+        </w:rPr>
+        <w:t>3</w:t>
+      </w:r>
+      <w:r>
+        <w:rPr>
+          <w:color w:val="8B0000"/>
+          <w:sz w:val="22"/>
+          <w:szCs w:val="22"/>
+        </w:rPr>
+        <w:t>.25</w:t>
+      </w:r>
+    </w:p>
+    <w:p>
+      <w:pPr>
+        <w:spacing w:after="20"/>
+        <w:rPr>
+          <w:color w:val="8B0000"/>
+          <w:sz w:val="22"/>
+          <w:szCs w:val="22"/>
+        </w:rPr>
+      </w:pPr>
+      <w:r>
+        <w:rPr>
+          <w:color w:val="8B0000"/>
+          <w:sz w:val="22"/>
+          <w:szCs w:val="22"/>
+        </w:rPr>
+        <w:t>Saturday:</w:t>
+      </w:r>
+    </w:p>
+    <w:p>
+      <w:pPr>
+        <w:spacing w:after="20"/>
+        <w:rPr>
+          <w:color w:val="8B0000"/>
+          <w:sz w:val="22"/>
+          <w:szCs w:val="22"/>
+        </w:rPr>
+      </w:pPr>
+      <w:r>
+        <w:rPr>
+          <w:color w:val="8B0000"/>
+          <w:sz w:val="22"/>
+          <w:szCs w:val="22"/>
+        </w:rPr>
+        <w:tab/>
+      </w:r>
+      <w:r>
+        <w:rPr>
+          <w:rFonts w:ascii="Algerian" w:hAnsi="Algerian"/>
+          <w:color w:val="8B0000"/>
+          <w:sz w:val="22"/>
+          <w:szCs w:val="22"/>
+        </w:rPr>
+        <w:t>*Pina Coladas</w:t>
+      </w:r>
+      <w:r>
+        <w:rPr>
+          <w:color w:val="8B0000"/>
+          <w:sz w:val="22"/>
+          <w:szCs w:val="22"/>
+        </w:rPr>
+        <w:t xml:space="preserve"> </w:t>
+      </w:r>
+      <w:r>
+        <w:rPr>
+          <w:color w:val="8B0000"/>
+          <w:sz w:val="22"/>
+          <w:szCs w:val="22"/>
+        </w:rPr>
+        <w:tab/>
+      </w:r>
+      <w:r>
+        <w:rPr>
+          <w:color w:val="8B0000"/>
+          <w:sz w:val="22"/>
+          <w:szCs w:val="22"/>
+        </w:rPr>
+        <w:tab/>
+      </w:r>
+      <w:r>
+        <w:rPr>
+          <w:color w:val="8B0000"/>
+          <w:sz w:val="22"/>
+          <w:szCs w:val="22"/>
+        </w:rPr>
+        <w:tab/>
+        <w:t>$6.25</w:t>
+      </w:r>
+    </w:p>
+    <w:p>
+      <w:pPr>
+        <w:spacing w:after="20"/>
+        <w:rPr>
+          <w:color w:val="8B0000"/>
+          <w:sz w:val="22"/>
+          <w:szCs w:val="22"/>
+        </w:rPr>
+      </w:pPr>
+      <w:r>
+        <w:rPr>
+          <w:color w:val="8B0000"/>
+          <w:sz w:val="22"/>
+          <w:szCs w:val="22"/>
+        </w:rPr>
+        <w:t>Sunday:</w:t>
+      </w:r>
+    </w:p>
+    <w:p>
+      <w:pPr>
+        <w:spacing w:after="20"/>
+        <w:rPr>
+          <w:color w:val="8B0000"/>
+          <w:sz w:val="22"/>
+          <w:szCs w:val="22"/>
+        </w:rPr>
+      </w:pPr>
+      <w:r>
+        <w:rPr>
+          <w:color w:val="8B0000"/>
+          <w:sz w:val="22"/>
+          <w:szCs w:val="22"/>
+        </w:rPr>
+        <w:tab/>
+      </w:r>
+      <w:r>
+        <w:rPr>
+          <w:rFonts w:ascii="Algerian" w:hAnsi="Algerian"/>
+          <w:color w:val="8B0000"/>
+          <w:sz w:val="22"/>
+          <w:szCs w:val="22"/>
+        </w:rPr>
+        <w:t>*Bloody Mary’s</w:t>
+      </w:r>
+      <w:r>
+        <w:rPr>
+          <w:color w:val="8B0000"/>
+          <w:sz w:val="22"/>
+          <w:szCs w:val="22"/>
+        </w:rPr>
+        <w:tab/>
+      </w:r>
+      <w:r>
+        <w:rPr>
+          <w:color w:val="8B0000"/>
+          <w:sz w:val="22"/>
+          <w:szCs w:val="22"/>
+        </w:rPr>
+        <w:tab/>
+      </w:r>
+      <w:r>
+        <w:rPr>
+          <w:color w:val="8B0000"/>
+          <w:sz w:val="22"/>
+          <w:szCs w:val="22"/>
+        </w:rPr>
+        <w:tab/>
+        <w:t>$6.25</w:t>
+      </w:r>
+    </w:p>
+    <w:p>
+      <w:pPr>
+        <w:rPr>
+          <w:color w:val="8B0000"/>
+        </w:rPr>
+      </w:pPr>
+    </w:p>
+    <w:p>
+      <w:pPr>
+        <w:rPr>
+          <w:color w:val="8B0000"/>
+        </w:rPr>
+      </w:pPr>
+    </w:p>
+    <w:p>
+      <w:pPr>
+        <w:rPr>
+          <w:color w:val="8B0000"/>
+        </w:rPr>
+      </w:pPr>
+    </w:p>
+    <w:p>
+      <w:pPr>
+        <w:spacing w:after="240"/>
+        <w:jc w:val="center"/>
+        <w:rPr>
+          <w:rFonts w:ascii="Felix Titling" w:hAnsi="Felix Titling"/>
+          <w:b/>
+          <w:color w:val="8B0000"/>
+          <w:spacing w:val="10"/>
+          <w:sz w:val="28"/>
+          <w:szCs w:val="28"/>
           <w:u w:val="single"/>
-        </w:rPr>
-        <w:t>Wednesday</w:t>
-      </w:r>
-      <w:r>
-        <w:rPr>
-          <w:color w:val="8B0000"/>
-        </w:rPr>
-        <w:t xml:space="preserve">: </w:t>
-      </w:r>
-      <w:r>
-        <w:rPr>
-          <w:color w:val="8B0000"/>
-        </w:rPr>
-        <w:t>(Kids eat Free Under 11)</w:t>
-      </w:r>
-    </w:p>
-    <w:p>
-      <w:pPr>
-        <w:spacing w:after="20"/>
-        <w:rPr>
-          <w:color w:val="8B0000"/>
-        </w:rPr>
-      </w:pPr>
-      <w:r>
-        <w:rPr>
-          <w:color w:val="8B0000"/>
-        </w:rPr>
-        <w:tab/>
-      </w:r>
-      <w:r>
-        <w:rPr>
-          <w:rFonts w:ascii="Algerian" w:hAnsi="Algerian"/>
-          <w:color w:val="8B0000"/>
-        </w:rPr>
-        <w:t>*</w:t>
-      </w:r>
-      <w:r>
-        <w:rPr>
-          <w:rFonts w:ascii="Algerian" w:hAnsi="Algerian"/>
-          <w:color w:val="8B0000"/>
-        </w:rPr>
-        <w:t>Margaritas</w:t>
-      </w:r>
-      <w:r>
-        <w:rPr>
-          <w:color w:val="8B0000"/>
-        </w:rPr>
-        <w:tab/>
-      </w:r>
-      <w:r>
-        <w:rPr>
-          <w:color w:val="8B0000"/>
-        </w:rPr>
-        <w:tab/>
-      </w:r>
-      <w:r>
-        <w:rPr>
-          <w:color w:val="8B0000"/>
-        </w:rPr>
-        <w:tab/>
-      </w:r>
-      <w:r>
-        <w:rPr>
-          <w:color w:val="8B0000"/>
-        </w:rPr>
-        <w:tab/>
-      </w:r>
-      <w:r>
-        <w:rPr>
-          <w:color w:val="8B0000"/>
-        </w:rPr>
-        <w:t>$6.25</w:t>
-      </w:r>
-    </w:p>
-    <w:p>
-      <w:pPr>
-        <w:spacing w:after="20"/>
-        <w:rPr>
-          <w:color w:val="8B0000"/>
+          <w14:shadow w14:blurRad="63500" w14:dist="50800" w14:dir="13500000" w14:sx="0" w14:sy="0" w14:kx="0" w14:ky="0" w14:algn="none">
+            <w14:srgbClr w14:val="000000">
+              <w14:alpha w14:val="50000"/>
+            </w14:srgbClr>
+          </w14:shadow>
+          <w14:textOutline w14:w="0" w14:cap="flat" w14:cmpd="sng" w14:algn="ctr">
+            <w14:noFill/>
+            <w14:prstDash w14:val="solid"/>
+            <w14:round/>
+          </w14:textOutline>
+        </w:rPr>
+      </w:pPr>
+      <w:r>
+        <w:rPr>
+          <w:rFonts w:ascii="Felix Titling" w:hAnsi="Felix Titling"/>
+          <w:b/>
+          <w:color w:val="8B0000"/>
+          <w:spacing w:val="10"/>
+          <w:sz w:val="28"/>
+          <w:szCs w:val="28"/>
           <w:u w:val="single"/>
-        </w:rPr>
-      </w:pPr>
-      <w:r>
-        <w:rPr>
-          <w:color w:val="8B0000"/>
+          <w14:shadow w14:blurRad="63500" w14:dist="50800" w14:dir="13500000" w14:sx="0" w14:sy="0" w14:kx="0" w14:ky="0" w14:algn="none">
+            <w14:srgbClr w14:val="000000">
+              <w14:alpha w14:val="50000"/>
+            </w14:srgbClr>
+          </w14:shadow>
+          <w14:textOutline w14:w="0" w14:cap="flat" w14:cmpd="sng" w14:algn="ctr">
+            <w14:noFill/>
+            <w14:prstDash w14:val="solid"/>
+            <w14:round/>
+          </w14:textOutline>
+        </w:rPr>
+        <w:t>Genghis Khan Mongolian</w:t>
+      </w:r>
+      <w:r>
+        <w:rPr>
+          <w:rFonts w:ascii="Felix Titling" w:hAnsi="Felix Titling"/>
+          <w:b/>
+          <w:color w:val="8B0000"/>
+          <w:spacing w:val="10"/>
+          <w:sz w:val="28"/>
+          <w:szCs w:val="28"/>
           <w:u w:val="single"/>
-        </w:rPr>
-        <w:t>Thursday</w:t>
-      </w:r>
-      <w:r>
+          <w14:shadow w14:blurRad="63500" w14:dist="50800" w14:dir="13500000" w14:sx="0" w14:sy="0" w14:kx="0" w14:ky="0" w14:algn="none">
+            <w14:srgbClr w14:val="000000">
+              <w14:alpha w14:val="50000"/>
+            </w14:srgbClr>
+          </w14:shadow>
+          <w14:textOutline w14:w="0" w14:cap="flat" w14:cmpd="sng" w14:algn="ctr">
+            <w14:noFill/>
+            <w14:prstDash w14:val="solid"/>
+            <w14:round/>
+          </w14:textOutline>
+        </w:rPr>
+        <w:t xml:space="preserve"> Barbeque</w:t>
+      </w:r>
+    </w:p>
+    <w:p>
+      <w:pPr>
+        <w:spacing w:after="0"/>
+        <w:jc w:val="center"/>
         <w:rPr>
           <w:color w:val="8B0000"/>
           <w:u w:val="single"/>
         </w:rPr>
-        <w:t>:</w:t>
-      </w:r>
-    </w:p>
-    <w:p>
-      <w:pPr>
-        <w:spacing w:after="20"/>
-        <w:rPr>
-          <w:color w:val="8B0000"/>
-        </w:rPr>
-      </w:pPr>
-      <w:r>
-        <w:rPr>
-          <w:color w:val="8B0000"/>
-        </w:rPr>
-        <w:tab/>
-      </w:r>
-      <w:r>
-        <w:rPr>
-          <w:rFonts w:ascii="Algerian" w:hAnsi="Algerian"/>
-          <w:color w:val="8B0000"/>
-        </w:rPr>
-        <w:t>*</w:t>
-      </w:r>
-      <w:r>
-        <w:rPr>
-          <w:rFonts w:ascii="Algerian" w:hAnsi="Algerian"/>
-          <w:color w:val="8B0000"/>
-        </w:rPr>
-        <w:t>Long Island Ice</w:t>
-      </w:r>
-      <w:r>
-        <w:rPr>
-          <w:rFonts w:ascii="Algerian" w:hAnsi="Algerian"/>
-          <w:color w:val="8B0000"/>
-        </w:rPr>
-        <w:t>d</w:t>
-      </w:r>
-      <w:r>
-        <w:rPr>
-          <w:rFonts w:ascii="Algerian" w:hAnsi="Algerian"/>
-          <w:color w:val="8B0000"/>
-        </w:rPr>
-        <w:t xml:space="preserve"> Tea</w:t>
-      </w:r>
-      <w:r>
-        <w:rPr>
-          <w:rFonts w:ascii="Algerian" w:hAnsi="Algerian"/>
-          <w:color w:val="8B0000"/>
-        </w:rPr>
-        <w:tab/>
-      </w:r>
-      <w:r>
-        <w:rPr>
-          <w:color w:val="8B0000"/>
-        </w:rPr>
-        <w:tab/>
-      </w:r>
-      <w:r>
-        <w:rPr>
-          <w:color w:val="8B0000"/>
-        </w:rPr>
-        <w:tab/>
-      </w:r>
-      <w:r>
-        <w:rPr>
-          <w:color w:val="8B0000"/>
-        </w:rPr>
-        <w:t>$6.25</w:t>
-      </w:r>
-    </w:p>
-    <w:p>
-      <w:pPr>
-        <w:spacing w:after="20"/>
-        <w:rPr>
-          <w:color w:val="8B0000"/>
-        </w:rPr>
       </w:pPr>
       <w:r>
         <w:rPr>
           <w:color w:val="8B0000"/>
           <w:u w:val="single"/>
         </w:rPr>
-        <w:t>Friday</w:t>
-      </w:r>
-      <w:r>
+        <w:t>Address</w:t>
+      </w:r>
+    </w:p>
+    <w:p>
+      <w:pPr>
+        <w:spacing w:after="240"/>
+        <w:jc w:val="center"/>
+        <w:rPr>
+          <w:color w:val="8B0000"/>
+        </w:rPr>
+      </w:pPr>
+      <w:r>
+        <w:rPr>
+          <w:color w:val="8B0000"/>
+        </w:rPr>
+        <w:t>5010 Bay City Road Midland Mi 48642</w:t>
+      </w:r>
+    </w:p>
+    <w:p>
+      <w:pPr>
+        <w:spacing w:after="0"/>
+        <w:jc w:val="center"/>
         <w:rPr>
           <w:color w:val="8B0000"/>
           <w:u w:val="single"/>
         </w:rPr>
-        <w:t xml:space="preserve">: </w:t>
-      </w:r>
+      </w:pPr>
       <w:r>
         <w:rPr>
           <w:color w:val="8B0000"/>
           <w:u w:val="single"/>
         </w:rPr>
-        <w:t>(Bottles)</w:t>
-      </w:r>
-    </w:p>
-    <w:p>
-      <w:pPr>
-        <w:spacing w:after="20"/>
-        <w:rPr>
-          <w:color w:val="8B0000"/>
-        </w:rPr>
-      </w:pPr>
-      <w:r>
-        <w:rPr>
-          <w:color w:val="8B0000"/>
-        </w:rPr>
-        <w:tab/>
-      </w:r>
-      <w:r>
-        <w:rPr>
-          <w:rFonts w:ascii="Algerian" w:hAnsi="Algerian"/>
-          <w:color w:val="8B0000"/>
-        </w:rPr>
-        <w:t>*</w:t>
-      </w:r>
-      <w:r>
-        <w:rPr>
-          <w:rFonts w:ascii="Algerian" w:hAnsi="Algerian"/>
-          <w:color w:val="8B0000"/>
-        </w:rPr>
-        <w:t>Budweiser &amp; Bud Light</w:t>
-      </w:r>
-      <w:r>
-        <w:rPr>
-          <w:color w:val="8B0000"/>
-        </w:rPr>
-        <w:tab/>
-      </w:r>
-      <w:r>
-        <w:rPr>
-          <w:color w:val="8B0000"/>
-        </w:rPr>
-        <w:tab/>
-      </w:r>
-      <w:r>
-        <w:rPr>
-          <w:color w:val="8B0000"/>
-        </w:rPr>
-        <w:tab/>
-      </w:r>
-      <w:r>
-        <w:rPr>
-          <w:color w:val="8B0000"/>
-        </w:rPr>
-        <w:t>$</w:t>
-      </w:r>
-      <w:r>
-        <w:rPr>
-          <w:color w:val="8B0000"/>
-        </w:rPr>
-        <w:t>3</w:t>
-      </w:r>
-      <w:r>
-        <w:rPr>
-          <w:color w:val="8B0000"/>
-        </w:rPr>
-        <w:t>.25</w:t>
-      </w:r>
-    </w:p>
-    <w:p>
-      <w:pPr>
-        <w:spacing w:after="20"/>
+        <w:t>Phone</w:t>
+      </w:r>
+    </w:p>
+    <w:p>
+      <w:pPr>
+        <w:spacing w:after="240"/>
+        <w:jc w:val="center"/>
+        <w:rPr>
+          <w:color w:val="8B0000"/>
+        </w:rPr>
+      </w:pPr>
+      <w:r>
+        <w:rPr>
+          <w:color w:val="8B0000"/>
+        </w:rPr>
+        <w:t>(989)-496-</w:t>
+      </w:r>
+      <w:r>
+        <w:rPr>
+          <w:color w:val="8B0000"/>
+        </w:rPr>
+        <w:t>2288</w:t>
+      </w:r>
+    </w:p>
+    <w:p>
+      <w:pPr>
+        <w:spacing w:after="0"/>
+        <w:jc w:val="center"/>
         <w:rPr>
           <w:color w:val="8B0000"/>
           <w:u w:val="single"/>
@@ -489,29 +865,17 @@
           <w:color w:val="8B0000"/>
           <w:u w:val="single"/>
         </w:rPr>
-        <w:t>Saturday:</w:t>
-      </w:r>
-    </w:p>
-    <w:p>
-      <w:pPr>
-        <w:spacing w:after="20"/>
-        <w:rPr>
-          <w:color w:val="8B0000"/>
-        </w:rPr>
-      </w:pPr>
-      <w:r>
-        <w:rPr>
-          <w:color w:val="8B0000"/>
-        </w:rPr>
-        <w:tab/>
-      </w:r>
-      <w:r>
-        <w:rPr>
-          <w:rFonts w:ascii="Algerian" w:hAnsi="Algerian"/>
-          <w:color w:val="8B0000"/>
-        </w:rPr>
-        <w:t>*Pina Coladas</w:t>
-      </w:r>
+        <w:t>Website</w:t>
+      </w:r>
+    </w:p>
+    <w:p>
+      <w:pPr>
+        <w:spacing w:after="240"/>
+        <w:jc w:val="center"/>
+        <w:rPr>
+          <w:color w:val="8B0000"/>
+        </w:rPr>
+      </w:pPr>
       <w:r>
         <w:rPr>
           <w:color w:val="8B0000"/>
@@ -522,36 +886,13 @@
         <w:rPr>
           <w:color w:val="8B0000"/>
         </w:rPr>
-        <w:tab/>
-      </w:r>
-      <w:r>
-        <w:rPr>
-          <w:color w:val="8B0000"/>
-        </w:rPr>
-        <w:tab/>
-      </w:r>
-      <w:r>
-        <w:rPr>
-          <w:color w:val="8B0000"/>
-        </w:rPr>
-        <w:tab/>
-      </w:r>
-      <w:r>
-        <w:rPr>
-          <w:color w:val="8B0000"/>
-        </w:rPr>
-        <w:tab/>
-      </w:r>
-      <w:r>
-        <w:rPr>
-          <w:color w:val="8B0000"/>
-        </w:rPr>
-        <w:t>$6.25</w:t>
-      </w:r>
-    </w:p>
-    <w:p>
-      <w:pPr>
-        <w:spacing w:after="20"/>
+        <w:t>ghengiskhanbbq.com</w:t>
+      </w:r>
+    </w:p>
+    <w:p>
+      <w:pPr>
+        <w:spacing w:after="0"/>
+        <w:jc w:val="center"/>
         <w:rPr>
           <w:color w:val="8B0000"/>
           <w:u w:val="single"/>
@@ -562,68 +903,82 @@
           <w:color w:val="8B0000"/>
           <w:u w:val="single"/>
         </w:rPr>
-        <w:t>Sunday:</w:t>
-      </w:r>
-    </w:p>
-    <w:p>
-      <w:pPr>
-        <w:spacing w:after="20"/>
-        <w:rPr>
-          <w:color w:val="8B0000"/>
-        </w:rPr>
-      </w:pPr>
-      <w:r>
-        <w:rPr>
-          <w:color w:val="8B0000"/>
-        </w:rPr>
-        <w:tab/>
-      </w:r>
-      <w:r>
-        <w:rPr>
-          <w:rFonts w:ascii="Algerian" w:hAnsi="Algerian"/>
-          <w:color w:val="8B0000"/>
-        </w:rPr>
-        <w:t>*Bloody Mary’s</w:t>
-      </w:r>
-      <w:r>
-        <w:rPr>
-          <w:color w:val="8B0000"/>
-        </w:rPr>
-        <w:tab/>
-      </w:r>
-      <w:r>
-        <w:rPr>
-          <w:color w:val="8B0000"/>
-        </w:rPr>
-        <w:tab/>
-      </w:r>
-      <w:r>
-        <w:rPr>
-          <w:color w:val="8B0000"/>
-        </w:rPr>
-        <w:tab/>
-      </w:r>
-      <w:r>
-        <w:rPr>
-          <w:color w:val="8B0000"/>
-        </w:rPr>
-        <w:tab/>
-      </w:r>
-      <w:r>
-        <w:rPr>
-          <w:color w:val="8B0000"/>
-        </w:rPr>
-        <w:t>$6.25</w:t>
+        <w:t>Facebook</w:t>
+      </w:r>
+    </w:p>
+    <w:p>
+      <w:pPr>
+        <w:spacing w:after="0"/>
+        <w:jc w:val="center"/>
+        <w:rPr>
+          <w:color w:val="8B0000"/>
+        </w:rPr>
+      </w:pPr>
+      <w:r>
+        <w:rPr>
+          <w:color w:val="8B0000"/>
+        </w:rPr>
+        <w:t>facebook.com/GhengisKhanMongolianBarbeque</w:t>
       </w:r>
     </w:p>
     <w:sectPr>
-      <w:pgSz w:w="7200" w:h="10080"/>
-      <w:pgMar w:top="720" w:right="720" w:bottom="720" w:left="720" w:header="720" w:footer="720" w:gutter="0"/>
+      <w:pgSz w:w="6480" w:h="8640"/>
+      <w:pgMar w:top="432" w:right="720" w:bottom="432" w:left="720" w:header="0" w:footer="0" w:gutter="0"/>
       <w:cols w:space="720"/>
       <w:docGrid w:linePitch="360"/>
     </w:sectPr>
   </w:body>
 </w:document>
+</file>
+
+<file path=word/endnotes.xml><?xml version="1.0" encoding="utf-8"?>
+<w:endnotes xmlns:wpc="http://schemas.microsoft.com/office/word/2010/wordprocessingCanvas" xmlns:cx="http://schemas.microsoft.com/office/drawing/2014/chartex" xmlns:cx1="http://schemas.microsoft.com/office/drawing/2015/9/8/chartex" xmlns:cx2="http://schemas.microsoft.com/office/drawing/2015/10/21/chartex" xmlns:cx3="http://schemas.microsoft.com/office/drawing/2016/5/9/chartex" xmlns:cx4="http://schemas.microsoft.com/office/drawing/2016/5/10/chartex" xmlns:cx5="http://schemas.microsoft.com/office/drawing/2016/5/11/chartex" xmlns:cx6="http://schemas.microsoft.com/office/drawing/2016/5/12/chartex" xmlns:cx7="http://schemas.microsoft.com/office/drawing/2016/5/13/chartex" xmlns:cx8="http://schemas.microsoft.com/office/drawing/2016/5/14/chartex" xmlns:mc="http://schemas.openxmlformats.org/markup-compatibility/2006" xmlns:aink="http://schemas.microsoft.com/office/drawing/2016/ink" xmlns:am3d="http://schemas.microsoft.com/office/drawing/2017/model3d" xmlns:o="urn:schemas-microsoft-com:office:office" xmlns:oel="http://schemas.microsoft.com/office/2019/extlst" xmlns:r="http://schemas.openxmlformats.org/officeDocument/2006/relationships" xmlns:m="http://schemas.openxmlformats.org/officeDocument/2006/math" xmlns:v="urn:schemas-microsoft-com:vml" xmlns:wp14="http://schemas.microsoft.com/office/word/2010/wordprocessingDrawing" xmlns:wp="http://schemas.openxmlformats.org/drawingml/2006/wordprocessingDrawing" xmlns:w10="urn:schemas-microsoft-com:office:word" xmlns:w="http://schemas.openxmlformats.org/wordprocessingml/2006/main" xmlns:w14="http://schemas.microsoft.com/office/word/2010/wordml" xmlns:w15="http://schemas.microsoft.com/office/word/2012/wordml" xmlns:w16cex="http://schemas.microsoft.com/office/word/2018/wordml/cex" xmlns:w16cid="http://schemas.microsoft.com/office/word/2016/wordml/cid" xmlns:w16="http://schemas.microsoft.com/office/word/2018/wordml" xmlns:w16du="http://schemas.microsoft.com/office/word/2023/wordml/word16du" xmlns:w16sdtdh="http://schemas.microsoft.com/office/word/2020/wordml/sdtdatahash" xmlns:w16sdtfl="http://schemas.microsoft.com/office/word/2024/wordml/sdtformatlock" xmlns:w16se="http://schemas.microsoft.com/office/word/2015/wordml/symex" xmlns:wpg="http://schemas.microsoft.com/office/word/2010/wordprocessingGroup" xmlns:wpi="http://schemas.microsoft.com/office/word/2010/wordprocessingInk" xmlns:wne="http://schemas.microsoft.com/office/word/2006/wordml" xmlns:wps="http://schemas.microsoft.com/office/word/2010/wordprocessingShape" mc:Ignorable="w14 w15 w16se w16cid w16 w16cex w16sdtdh w16sdtfl w16du wp14">
+  <w:endnote w:type="separator" w:id="-1">
+    <w:p>
+      <w:pPr>
+        <w:spacing w:after="0" w:line="240" w:lineRule="auto"/>
+      </w:pPr>
+      <w:r>
+        <w:separator/>
+      </w:r>
+    </w:p>
+  </w:endnote>
+  <w:endnote w:type="continuationSeparator" w:id="0">
+    <w:p>
+      <w:pPr>
+        <w:spacing w:after="0" w:line="240" w:lineRule="auto"/>
+      </w:pPr>
+      <w:r>
+        <w:continuationSeparator/>
+      </w:r>
+    </w:p>
+  </w:endnote>
+</w:endnotes>
+</file>
+
+<file path=word/footnotes.xml><?xml version="1.0" encoding="utf-8"?>
+<w:footnotes xmlns:wpc="http://schemas.microsoft.com/office/word/2010/wordprocessingCanvas" xmlns:cx="http://schemas.microsoft.com/office/drawing/2014/chartex" xmlns:cx1="http://schemas.microsoft.com/office/drawing/2015/9/8/chartex" xmlns:cx2="http://schemas.microsoft.com/office/drawing/2015/10/21/chartex" xmlns:cx3="http://schemas.microsoft.com/office/drawing/2016/5/9/chartex" xmlns:cx4="http://schemas.microsoft.com/office/drawing/2016/5/10/chartex" xmlns:cx5="http://schemas.microsoft.com/office/drawing/2016/5/11/chartex" xmlns:cx6="http://schemas.microsoft.com/office/drawing/2016/5/12/chartex" xmlns:cx7="http://schemas.microsoft.com/office/drawing/2016/5/13/chartex" xmlns:cx8="http://schemas.microsoft.com/office/drawing/2016/5/14/chartex" xmlns:mc="http://schemas.openxmlformats.org/markup-compatibility/2006" xmlns:aink="http://schemas.microsoft.com/office/drawing/2016/ink" xmlns:am3d="http://schemas.microsoft.com/office/drawing/2017/model3d" xmlns:o="urn:schemas-microsoft-com:office:office" xmlns:oel="http://schemas.microsoft.com/office/2019/extlst" xmlns:r="http://schemas.openxmlformats.org/officeDocument/2006/relationships" xmlns:m="http://schemas.openxmlformats.org/officeDocument/2006/math" xmlns:v="urn:schemas-microsoft-com:vml" xmlns:wp14="http://schemas.microsoft.com/office/word/2010/wordprocessingDrawing" xmlns:wp="http://schemas.openxmlformats.org/drawingml/2006/wordprocessingDrawing" xmlns:w10="urn:schemas-microsoft-com:office:word" xmlns:w="http://schemas.openxmlformats.org/wordprocessingml/2006/main" xmlns:w14="http://schemas.microsoft.com/office/word/2010/wordml" xmlns:w15="http://schemas.microsoft.com/office/word/2012/wordml" xmlns:w16cex="http://schemas.microsoft.com/office/word/2018/wordml/cex" xmlns:w16cid="http://schemas.microsoft.com/office/word/2016/wordml/cid" xmlns:w16="http://schemas.microsoft.com/office/word/2018/wordml" xmlns:w16du="http://schemas.microsoft.com/office/word/2023/wordml/word16du" xmlns:w16sdtdh="http://schemas.microsoft.com/office/word/2020/wordml/sdtdatahash" xmlns:w16sdtfl="http://schemas.microsoft.com/office/word/2024/wordml/sdtformatlock" xmlns:w16se="http://schemas.microsoft.com/office/word/2015/wordml/symex" xmlns:wpg="http://schemas.microsoft.com/office/word/2010/wordprocessingGroup" xmlns:wpi="http://schemas.microsoft.com/office/word/2010/wordprocessingInk" xmlns:wne="http://schemas.microsoft.com/office/word/2006/wordml" xmlns:wps="http://schemas.microsoft.com/office/word/2010/wordprocessingShape" mc:Ignorable="w14 w15 w16se w16cid w16 w16cex w16sdtdh w16sdtfl w16du wp14">
+  <w:footnote w:type="separator" w:id="-1">
+    <w:p>
+      <w:pPr>
+        <w:spacing w:after="0" w:line="240" w:lineRule="auto"/>
+      </w:pPr>
+      <w:r>
+        <w:separator/>
+      </w:r>
+    </w:p>
+  </w:footnote>
+  <w:footnote w:type="continuationSeparator" w:id="0">
+    <w:p>
+      <w:pPr>
+        <w:spacing w:after="0" w:line="240" w:lineRule="auto"/>
+      </w:pPr>
+      <w:r>
+        <w:continuationSeparator/>
+      </w:r>
+    </w:p>
+  </w:footnote>
+</w:footnotes>
 </file>
 
 <file path=word/numbering.xml><?xml version="1.0" encoding="utf-8"?>
@@ -1263,6 +1618,7 @@
   <w:style w:type="paragraph" w:default="1" w:styleId="Normal">
     <w:name w:val="Normal"/>
     <w:qFormat/>
+    <w:rsid w:val="00707FB2"/>
   </w:style>
   <w:style w:type="paragraph" w:styleId="Heading1">
     <w:name w:val="heading 1"/>
@@ -1801,6 +2157,50 @@
       <w:color w:val="605E5C"/>
       <w:shd w:val="clear" w:color="auto" w:fill="E1DFDD"/>
     </w:rPr>
+  </w:style>
+  <w:style w:type="paragraph" w:styleId="Header">
+    <w:name w:val="header"/>
+    <w:basedOn w:val="Normal"/>
+    <w:link w:val="HeaderChar"/>
+    <w:uiPriority w:val="99"/>
+    <w:unhideWhenUsed/>
+    <w:rsid w:val="00985D27"/>
+    <w:pPr>
+      <w:tabs>
+        <w:tab w:val="center" w:pos="4680"/>
+        <w:tab w:val="right" w:pos="9360"/>
+      </w:tabs>
+      <w:spacing w:after="0" w:line="240" w:lineRule="auto"/>
+    </w:pPr>
+  </w:style>
+  <w:style w:type="character" w:customStyle="1" w:styleId="HeaderChar">
+    <w:name w:val="Header Char"/>
+    <w:basedOn w:val="DefaultParagraphFont"/>
+    <w:link w:val="Header"/>
+    <w:uiPriority w:val="99"/>
+    <w:rsid w:val="00985D27"/>
+  </w:style>
+  <w:style w:type="paragraph" w:styleId="Footer">
+    <w:name w:val="footer"/>
+    <w:basedOn w:val="Normal"/>
+    <w:link w:val="FooterChar"/>
+    <w:uiPriority w:val="99"/>
+    <w:unhideWhenUsed/>
+    <w:rsid w:val="00985D27"/>
+    <w:pPr>
+      <w:tabs>
+        <w:tab w:val="center" w:pos="4680"/>
+        <w:tab w:val="right" w:pos="9360"/>
+      </w:tabs>
+      <w:spacing w:after="0" w:line="240" w:lineRule="auto"/>
+    </w:pPr>
+  </w:style>
+  <w:style w:type="character" w:customStyle="1" w:styleId="FooterChar">
+    <w:name w:val="Footer Char"/>
+    <w:basedOn w:val="DefaultParagraphFont"/>
+    <w:link w:val="Footer"/>
+    <w:uiPriority w:val="99"/>
+    <w:rsid w:val="00985D27"/>
   </w:style>
 </w:styles>
 </file>

</xml_diff>

<commit_message>
uploading changes to phyiscal menu
</commit_message>
<xml_diff>
--- a/mongo_menu_pics/Genghis Khan Mongolian.docx
+++ b/mongo_menu_pics/Genghis Khan Mongolian.docx
@@ -210,8 +210,8 @@
         <w:rPr>
           <w:rFonts w:ascii="Algerian" w:hAnsi="Algerian"/>
           <w:color w:val="8B0000"/>
-          <w:sz w:val="32"/>
-          <w:szCs w:val="32"/>
+          <w:sz w:val="28"/>
+          <w:szCs w:val="28"/>
           <w:u w:val="single"/>
         </w:rPr>
       </w:pPr>
@@ -219,8 +219,8 @@
         <w:rPr>
           <w:rFonts w:ascii="Algerian" w:hAnsi="Algerian"/>
           <w:color w:val="8B0000"/>
-          <w:sz w:val="32"/>
-          <w:szCs w:val="32"/>
+          <w:sz w:val="28"/>
+          <w:szCs w:val="28"/>
           <w:u w:val="single"/>
         </w:rPr>
         <w:t>Daily Specials</w:t>
@@ -828,6 +828,13 @@
           <w:u w:val="single"/>
         </w:rPr>
         <w:t>Phone</w:t>
+      </w:r>
+      <w:r>
+        <w:rPr>
+          <w:color w:val="8B0000"/>
+          <w:u w:val="single"/>
+        </w:rPr>
+        <w:t>#</w:t>
       </w:r>
     </w:p>
     <w:p>
@@ -1822,6 +1829,7 @@
   <w:style w:type="character" w:default="1" w:styleId="DefaultParagraphFont">
     <w:name w:val="Default Paragraph Font"/>
     <w:uiPriority w:val="1"/>
+    <w:semiHidden/>
     <w:unhideWhenUsed/>
   </w:style>
   <w:style w:type="table" w:default="1" w:styleId="TableNormal">

</xml_diff>

<commit_message>
adding final corrected version of pdf and docx
</commit_message>
<xml_diff>
--- a/mongo_menu_pics/Genghis Khan Mongolian.docx
+++ b/mongo_menu_pics/Genghis Khan Mongolian.docx
@@ -257,7 +257,55 @@
           <w:sz w:val="22"/>
           <w:szCs w:val="22"/>
         </w:rPr>
-        <w:t>(Kids eat Free Under 11)</w:t>
+        <w:t>(</w:t>
+      </w:r>
+      <w:r>
+        <w:rPr>
+          <w:color w:val="8B0000"/>
+          <w:sz w:val="22"/>
+          <w:szCs w:val="22"/>
+        </w:rPr>
+        <w:t>k</w:t>
+      </w:r>
+      <w:r>
+        <w:rPr>
+          <w:color w:val="8B0000"/>
+          <w:sz w:val="22"/>
+          <w:szCs w:val="22"/>
+        </w:rPr>
+        <w:t xml:space="preserve">ids eat </w:t>
+      </w:r>
+      <w:r>
+        <w:rPr>
+          <w:color w:val="8B0000"/>
+          <w:sz w:val="22"/>
+          <w:szCs w:val="22"/>
+        </w:rPr>
+        <w:t>F</w:t>
+      </w:r>
+      <w:r>
+        <w:rPr>
+          <w:color w:val="8B0000"/>
+          <w:sz w:val="22"/>
+          <w:szCs w:val="22"/>
+        </w:rPr>
+        <w:t xml:space="preserve">ree </w:t>
+      </w:r>
+      <w:r>
+        <w:rPr>
+          <w:color w:val="8B0000"/>
+          <w:sz w:val="22"/>
+          <w:szCs w:val="22"/>
+        </w:rPr>
+        <w:t>u</w:t>
+      </w:r>
+      <w:r>
+        <w:rPr>
+          <w:color w:val="8B0000"/>
+          <w:sz w:val="22"/>
+          <w:szCs w:val="22"/>
+        </w:rPr>
+        <w:t>nder 11)</w:t>
       </w:r>
     </w:p>
     <w:p>
@@ -293,7 +341,7 @@
           <w:sz w:val="22"/>
           <w:szCs w:val="22"/>
         </w:rPr>
-        <w:t>Margaritas</w:t>
+        <w:t>Margarita</w:t>
       </w:r>
       <w:r>
         <w:rPr>
@@ -325,6 +373,14 @@
           <w:sz w:val="22"/>
           <w:szCs w:val="22"/>
         </w:rPr>
+        <w:tab/>
+      </w:r>
+      <w:r>
+        <w:rPr>
+          <w:color w:val="8B0000"/>
+          <w:sz w:val="22"/>
+          <w:szCs w:val="22"/>
+        </w:rPr>
         <w:t>$6.25</w:t>
       </w:r>
     </w:p>
@@ -464,7 +520,23 @@
           <w:sz w:val="22"/>
           <w:szCs w:val="22"/>
         </w:rPr>
-        <w:t>(Bottles)</w:t>
+        <w:t>(</w:t>
+      </w:r>
+      <w:r>
+        <w:rPr>
+          <w:color w:val="8B0000"/>
+          <w:sz w:val="22"/>
+          <w:szCs w:val="22"/>
+        </w:rPr>
+        <w:t>b</w:t>
+      </w:r>
+      <w:r>
+        <w:rPr>
+          <w:color w:val="8B0000"/>
+          <w:sz w:val="22"/>
+          <w:szCs w:val="22"/>
+        </w:rPr>
+        <w:t>ottles)</w:t>
       </w:r>
     </w:p>
     <w:p>
@@ -585,7 +657,7 @@
           <w:sz w:val="22"/>
           <w:szCs w:val="22"/>
         </w:rPr>
-        <w:t>*Pina Coladas</w:t>
+        <w:t>*Pina Colada</w:t>
       </w:r>
       <w:r>
         <w:rPr>
@@ -663,7 +735,7 @@
           <w:sz w:val="22"/>
           <w:szCs w:val="22"/>
         </w:rPr>
-        <w:t>*Bloody Mary’s</w:t>
+        <w:t>*Bloody Mary</w:t>
       </w:r>
       <w:r>
         <w:rPr>
@@ -926,6 +998,525 @@
           <w:color w:val="8B0000"/>
         </w:rPr>
         <w:t>facebook.com/GhengisKhanMongolianBarbeque</w:t>
+      </w:r>
+    </w:p>
+    <w:p>
+      <w:pPr>
+        <w:rPr>
+          <w:b/>
+          <w:bCs/>
+          <w:color w:val="8B0000"/>
+        </w:rPr>
+      </w:pPr>
+      <w:r>
+        <w:rPr>
+          <w:b/>
+          <w:bCs/>
+          <w:color w:val="8B0000"/>
+        </w:rPr>
+        <w:br w:type="page"/>
+      </w:r>
+    </w:p>
+    <w:p>
+      <w:pPr>
+        <w:jc w:val="center"/>
+        <w:rPr>
+          <w:rFonts w:ascii="Brush Script MT" w:hAnsi="Brush Script MT"/>
+          <w:color w:val="8B0000"/>
+          <w:sz w:val="40"/>
+          <w:szCs w:val="40"/>
+          <w:u w:val="single"/>
+        </w:rPr>
+      </w:pPr>
+      <w:r>
+        <w:rPr>
+          <w:rFonts w:ascii="Brush Script MT" w:hAnsi="Brush Script MT"/>
+          <w:color w:val="8B0000"/>
+          <w:sz w:val="40"/>
+          <w:szCs w:val="40"/>
+          <w:u w:val="single"/>
+        </w:rPr>
+        <w:lastRenderedPageBreak/>
+        <w:t>Mongolia</w:t>
+      </w:r>
+      <w:r>
+        <w:rPr>
+          <w:rFonts w:ascii="Brush Script MT" w:hAnsi="Brush Script MT"/>
+          <w:color w:val="8B0000"/>
+          <w:sz w:val="40"/>
+          <w:szCs w:val="40"/>
+          <w:u w:val="single"/>
+        </w:rPr>
+        <w:t>n Fun Facts:</w:t>
+      </w:r>
+    </w:p>
+    <w:p>
+      <w:pPr>
+        <w:spacing w:after="240"/>
+        <w:jc w:val="center"/>
+        <w:rPr>
+          <w:rFonts w:ascii="Fairwater Script" w:hAnsi="Fairwater Script"/>
+          <w:bCs/>
+          <w:color w:val="8B0000"/>
+          <w:spacing w:val="10"/>
+          <w:sz w:val="22"/>
+          <w:szCs w:val="22"/>
+          <w:u w:val="single"/>
+          <w14:shadow w14:blurRad="63500" w14:dist="50800" w14:dir="13500000" w14:sx="0" w14:sy="0" w14:kx="0" w14:ky="0" w14:algn="none">
+            <w14:srgbClr w14:val="000000">
+              <w14:alpha w14:val="50000"/>
+            </w14:srgbClr>
+          </w14:shadow>
+          <w14:textOutline w14:w="0" w14:cap="flat" w14:cmpd="sng" w14:algn="ctr">
+            <w14:noFill/>
+            <w14:prstDash w14:val="solid"/>
+            <w14:round/>
+          </w14:textOutline>
+        </w:rPr>
+      </w:pPr>
+    </w:p>
+    <w:p>
+      <w:pPr>
+        <w:spacing w:after="240"/>
+        <w:jc w:val="center"/>
+        <w:rPr>
+          <w:rFonts w:ascii="Fairwater Script" w:hAnsi="Fairwater Script"/>
+          <w:bCs/>
+          <w:color w:val="8B0000"/>
+          <w:spacing w:val="10"/>
+          <w:sz w:val="22"/>
+          <w:szCs w:val="22"/>
+          <w:u w:val="single"/>
+          <w14:shadow w14:blurRad="63500" w14:dist="50800" w14:dir="13500000" w14:sx="0" w14:sy="0" w14:kx="0" w14:ky="0" w14:algn="none">
+            <w14:srgbClr w14:val="000000">
+              <w14:alpha w14:val="50000"/>
+            </w14:srgbClr>
+          </w14:shadow>
+          <w14:textOutline w14:w="0" w14:cap="flat" w14:cmpd="sng" w14:algn="ctr">
+            <w14:noFill/>
+            <w14:prstDash w14:val="solid"/>
+            <w14:round/>
+          </w14:textOutline>
+        </w:rPr>
+      </w:pPr>
+    </w:p>
+    <w:p>
+      <w:pPr>
+        <w:jc w:val="center"/>
+        <w:rPr>
+          <w:rFonts w:ascii="Fairwater Script" w:hAnsi="Fairwater Script"/>
+          <w:color w:val="8B0000"/>
+        </w:rPr>
+      </w:pPr>
+      <w:r>
+        <w:rPr>
+          <w:rFonts w:ascii="Fairwater Script" w:hAnsi="Fairwater Script"/>
+          <w:color w:val="8B0000"/>
+        </w:rPr>
+        <w:t xml:space="preserve">Mongolia is the </w:t>
+      </w:r>
+      <w:r>
+        <w:rPr>
+          <w:rFonts w:ascii="Garamond" w:hAnsi="Garamond"/>
+          <w:color w:val="8B0000"/>
+        </w:rPr>
+        <w:t>19</w:t>
+      </w:r>
+      <w:r>
+        <w:rPr>
+          <w:rFonts w:ascii="Fairwater Script" w:hAnsi="Fairwater Script"/>
+          <w:color w:val="8B0000"/>
+        </w:rPr>
+        <w:t>th largest country in the world and the 2nd largest landlocked country, yet it has one of the lowest population densities due to its harsh terrain and extreme climate.</w:t>
+      </w:r>
+    </w:p>
+    <w:p>
+      <w:pPr>
+        <w:jc w:val="center"/>
+        <w:rPr>
+          <w:rFonts w:ascii="Fairwater Script" w:hAnsi="Fairwater Script"/>
+          <w:color w:val="8B0000"/>
+        </w:rPr>
+      </w:pPr>
+    </w:p>
+    <w:p>
+      <w:pPr>
+        <w:jc w:val="center"/>
+        <w:rPr>
+          <w:rFonts w:ascii="Fairwater Script" w:hAnsi="Fairwater Script"/>
+          <w:color w:val="8B0000"/>
+        </w:rPr>
+      </w:pPr>
+    </w:p>
+    <w:p>
+      <w:pPr>
+        <w:jc w:val="center"/>
+        <w:rPr>
+          <w:rFonts w:ascii="Fairwater Script" w:hAnsi="Fairwater Script"/>
+          <w:color w:val="8B0000"/>
+          <w:sz w:val="22"/>
+          <w:szCs w:val="22"/>
+        </w:rPr>
+      </w:pPr>
+      <w:r>
+        <w:rPr>
+          <w:rFonts w:ascii="Fairwater Script" w:hAnsi="Fairwater Script"/>
+          <w:color w:val="8B0000"/>
+        </w:rPr>
+        <w:t>Known as “Land of the Eternal Blue Sky,” Mongolia enjoys sunshine up to 250 days a year, but summer</w:t>
+      </w:r>
+      <w:r>
+        <w:rPr>
+          <w:rFonts w:ascii="Fairwater Script" w:hAnsi="Fairwater Script"/>
+          <w:color w:val="8B0000"/>
+        </w:rPr>
+        <w:t>s</w:t>
+      </w:r>
+      <w:r>
+        <w:rPr>
+          <w:rFonts w:ascii="Fairwater Script" w:hAnsi="Fairwater Script"/>
+          <w:color w:val="8B0000"/>
+        </w:rPr>
+        <w:t xml:space="preserve"> last only a few weeks before the long winter sets in,</w:t>
+      </w:r>
+      <w:r>
+        <w:rPr>
+          <w:rFonts w:ascii="Fairwater Script" w:hAnsi="Fairwater Script"/>
+          <w:color w:val="8B0000"/>
+        </w:rPr>
+        <w:t xml:space="preserve"> </w:t>
+      </w:r>
+      <w:r>
+        <w:rPr>
+          <w:rFonts w:ascii="Fairwater Script" w:hAnsi="Fairwater Script"/>
+          <w:color w:val="8B0000"/>
+        </w:rPr>
+        <w:t xml:space="preserve">with temperatures </w:t>
+      </w:r>
+      <w:r>
+        <w:rPr>
+          <w:rFonts w:ascii="Fairwater Script" w:hAnsi="Fairwater Script"/>
+          <w:color w:val="8B0000"/>
+        </w:rPr>
+        <w:t>plunging</w:t>
+      </w:r>
+      <w:r>
+        <w:rPr>
+          <w:rFonts w:ascii="Fairwater Script" w:hAnsi="Fairwater Script"/>
+          <w:color w:val="8B0000"/>
+        </w:rPr>
+        <w:t xml:space="preserve"> to </w:t>
+      </w:r>
+      <w:r>
+        <w:rPr>
+          <w:rFonts w:ascii="Fairwater Script" w:hAnsi="Fairwater Script"/>
+          <w:color w:val="8B0000"/>
+        </w:rPr>
+        <w:t xml:space="preserve">           </w:t>
+      </w:r>
+      <w:r>
+        <w:rPr>
+          <w:rFonts w:ascii="Fairwater Script" w:hAnsi="Fairwater Script"/>
+          <w:color w:val="8B0000"/>
+        </w:rPr>
+        <w:t>-</w:t>
+      </w:r>
+      <w:r>
+        <w:rPr>
+          <w:rFonts w:ascii="Fairwater Script" w:hAnsi="Fairwater Script"/>
+          <w:color w:val="8B0000"/>
+        </w:rPr>
+        <w:t>30°F</w:t>
+      </w:r>
+      <w:r>
+        <w:rPr>
+          <w:rFonts w:ascii="Fairwater Script" w:hAnsi="Fairwater Script"/>
+          <w:color w:val="8B0000"/>
+        </w:rPr>
+        <w:t>.</w:t>
+      </w:r>
+      <w:r>
+        <w:rPr>
+          <w:rFonts w:ascii="Fairwater Script" w:hAnsi="Fairwater Script"/>
+          <w:color w:val="8B0000"/>
+          <w:sz w:val="22"/>
+          <w:szCs w:val="22"/>
+        </w:rPr>
+        <w:br w:type="page"/>
+      </w:r>
+    </w:p>
+    <w:p>
+      <w:pPr>
+        <w:jc w:val="center"/>
+        <w:rPr>
+          <w:rFonts w:ascii="Brush Script MT" w:hAnsi="Brush Script MT"/>
+          <w:color w:val="8B0000"/>
+          <w:sz w:val="40"/>
+          <w:szCs w:val="40"/>
+          <w:u w:val="single"/>
+        </w:rPr>
+      </w:pPr>
+      <w:r>
+        <w:rPr>
+          <w:rFonts w:ascii="Brush Script MT" w:hAnsi="Brush Script MT"/>
+          <w:color w:val="8B0000"/>
+          <w:sz w:val="40"/>
+          <w:szCs w:val="40"/>
+          <w:u w:val="single"/>
+        </w:rPr>
+        <w:lastRenderedPageBreak/>
+        <w:t>Mongolian Fun Facts:</w:t>
+      </w:r>
+    </w:p>
+    <w:p>
+      <w:pPr>
+        <w:jc w:val="center"/>
+        <w:rPr>
+          <w:rFonts w:ascii="Brush Script MT" w:hAnsi="Brush Script MT"/>
+          <w:color w:val="8B0000"/>
+          <w:sz w:val="16"/>
+          <w:szCs w:val="16"/>
+          <w:u w:val="single"/>
+        </w:rPr>
+      </w:pPr>
+    </w:p>
+    <w:p>
+      <w:pPr>
+        <w:jc w:val="center"/>
+        <w:rPr>
+          <w:rFonts w:ascii="Brush Script MT" w:hAnsi="Brush Script MT"/>
+          <w:color w:val="8B0000"/>
+          <w:sz w:val="40"/>
+          <w:szCs w:val="40"/>
+          <w:u w:val="single"/>
+        </w:rPr>
+      </w:pPr>
+    </w:p>
+    <w:p>
+      <w:pPr>
+        <w:jc w:val="center"/>
+        <w:rPr>
+          <w:rFonts w:ascii="Fairwater Script" w:hAnsi="Fairwater Script"/>
+          <w:color w:val="8B0000"/>
+        </w:rPr>
+      </w:pPr>
+      <w:r>
+        <w:rPr>
+          <w:rFonts w:ascii="Fairwater Script" w:hAnsi="Fairwater Script"/>
+          <w:color w:val="8B0000"/>
+        </w:rPr>
+        <w:t xml:space="preserve">There are almost as many horses as people in Mongolia. A local saying goes, “A Mongol without a horse is like a bird without wings.” The country is also known for snow leopards and </w:t>
+      </w:r>
+      <w:r>
+        <w:rPr>
+          <w:rFonts w:ascii="Fairwater Script" w:hAnsi="Fairwater Script"/>
+          <w:color w:val="8B0000"/>
+        </w:rPr>
+        <w:t xml:space="preserve">   </w:t>
+      </w:r>
+      <w:r>
+        <w:rPr>
+          <w:rFonts w:ascii="Fairwater Script" w:hAnsi="Fairwater Script"/>
+          <w:color w:val="8B0000"/>
+        </w:rPr>
+        <w:t>two-humped camels.</w:t>
+      </w:r>
+    </w:p>
+    <w:p>
+      <w:pPr>
+        <w:jc w:val="center"/>
+        <w:rPr>
+          <w:rFonts w:ascii="Fairwater Script" w:hAnsi="Fairwater Script"/>
+          <w:color w:val="8B0000"/>
+          <w:sz w:val="22"/>
+          <w:szCs w:val="22"/>
+        </w:rPr>
+      </w:pPr>
+    </w:p>
+    <w:p>
+      <w:pPr>
+        <w:jc w:val="center"/>
+        <w:rPr>
+          <w:rFonts w:ascii="Fairwater Script" w:hAnsi="Fairwater Script"/>
+          <w:color w:val="8B0000"/>
+          <w:sz w:val="22"/>
+          <w:szCs w:val="22"/>
+        </w:rPr>
+      </w:pPr>
+    </w:p>
+    <w:p>
+      <w:pPr>
+        <w:jc w:val="center"/>
+        <w:rPr>
+          <w:rFonts w:ascii="Fairwater Script" w:hAnsi="Fairwater Script"/>
+          <w:color w:val="8B0000"/>
+        </w:rPr>
+      </w:pPr>
+      <w:r>
+        <w:rPr>
+          <w:rFonts w:ascii="Fairwater Script" w:hAnsi="Fairwater Script"/>
+          <w:color w:val="8B0000"/>
+        </w:rPr>
+        <w:t>More than a quarter of Mongolians are nomads, living in harmony with nature. They move their livestock with the changing seasons and are famously hospitable</w:t>
+      </w:r>
+      <w:r>
+        <w:rPr>
+          <w:rFonts w:ascii="Fairwater Script" w:hAnsi="Fairwater Script"/>
+          <w:color w:val="8B0000"/>
+        </w:rPr>
+        <w:t>.</w:t>
+      </w:r>
+      <w:r>
+        <w:rPr>
+          <w:rFonts w:ascii="Fairwater Script" w:hAnsi="Fairwater Script"/>
+          <w:color w:val="8B0000"/>
+        </w:rPr>
+        <w:br w:type="page"/>
+      </w:r>
+    </w:p>
+    <w:p>
+      <w:pPr>
+        <w:jc w:val="center"/>
+        <w:rPr>
+          <w:rFonts w:ascii="Brush Script MT" w:hAnsi="Brush Script MT"/>
+          <w:color w:val="8B0000"/>
+          <w:sz w:val="40"/>
+          <w:szCs w:val="40"/>
+          <w:u w:val="single"/>
+        </w:rPr>
+      </w:pPr>
+      <w:r>
+        <w:rPr>
+          <w:rFonts w:ascii="Brush Script MT" w:hAnsi="Brush Script MT"/>
+          <w:color w:val="8B0000"/>
+          <w:sz w:val="40"/>
+          <w:szCs w:val="40"/>
+          <w:u w:val="single"/>
+        </w:rPr>
+        <w:lastRenderedPageBreak/>
+        <w:t>Mongolian Fun Facts:</w:t>
+      </w:r>
+    </w:p>
+    <w:p>
+      <w:pPr>
+        <w:jc w:val="center"/>
+        <w:rPr>
+          <w:rFonts w:ascii="Fairwater Script" w:hAnsi="Fairwater Script"/>
+          <w:color w:val="8B0000"/>
+          <w:sz w:val="22"/>
+          <w:szCs w:val="22"/>
+        </w:rPr>
+      </w:pPr>
+    </w:p>
+    <w:p>
+      <w:pPr>
+        <w:jc w:val="center"/>
+        <w:rPr>
+          <w:rFonts w:ascii="Fairwater Script" w:hAnsi="Fairwater Script"/>
+          <w:color w:val="8B0000"/>
+          <w:sz w:val="22"/>
+          <w:szCs w:val="22"/>
+        </w:rPr>
+      </w:pPr>
+    </w:p>
+    <w:p>
+      <w:pPr>
+        <w:jc w:val="center"/>
+        <w:rPr>
+          <w:rFonts w:ascii="Fairwater Script" w:hAnsi="Fairwater Script"/>
+          <w:color w:val="8B0000"/>
+        </w:rPr>
+      </w:pPr>
+      <w:r>
+        <w:rPr>
+          <w:rFonts w:ascii="Fairwater Script" w:hAnsi="Fairwater Script"/>
+          <w:color w:val="8B0000"/>
+        </w:rPr>
+        <w:t>Genghis Khan created the largest contiguous empire in history, stretching from Eastern Europe to the Sea of Japan — over 12 million square miles.</w:t>
+      </w:r>
+    </w:p>
+    <w:p>
+      <w:pPr>
+        <w:jc w:val="center"/>
+        <w:rPr>
+          <w:rFonts w:ascii="Fairwater Script" w:hAnsi="Fairwater Script"/>
+          <w:color w:val="8B0000"/>
+        </w:rPr>
+      </w:pPr>
+    </w:p>
+    <w:p>
+      <w:pPr>
+        <w:jc w:val="center"/>
+        <w:rPr>
+          <w:rFonts w:ascii="Fairwater Script" w:hAnsi="Fairwater Script"/>
+          <w:color w:val="8B0000"/>
+        </w:rPr>
+      </w:pPr>
+      <w:r>
+        <w:rPr>
+          <w:rFonts w:ascii="Fairwater Script" w:hAnsi="Fairwater Script"/>
+          <w:color w:val="8B0000"/>
+        </w:rPr>
+        <w:t>Genghis Khan created one of the first international postal systems, the “Yam,” a network of riders and stations that could carry messages up to 200 miles a day across his empire.</w:t>
+      </w:r>
+    </w:p>
+    <w:p>
+      <w:pPr>
+        <w:jc w:val="center"/>
+        <w:rPr>
+          <w:rFonts w:ascii="Fairwater Script" w:hAnsi="Fairwater Script"/>
+          <w:color w:val="8B0000"/>
+        </w:rPr>
+      </w:pPr>
+    </w:p>
+    <w:p>
+      <w:pPr>
+        <w:jc w:val="center"/>
+        <w:rPr>
+          <w:rFonts w:ascii="Fairwater Script" w:hAnsi="Fairwater Script"/>
+          <w:i/>
+          <w:iCs/>
+          <w:color w:val="8B0000"/>
+        </w:rPr>
+      </w:pPr>
+      <w:r>
+        <w:rPr>
+          <w:rFonts w:ascii="Fairwater Script" w:hAnsi="Fairwater Script"/>
+          <w:b/>
+          <w:bCs/>
+          <w:color w:val="8B0000"/>
+        </w:rPr>
+        <w:t>Fun Khan Joke:</w:t>
+      </w:r>
+      <w:r>
+        <w:rPr>
+          <w:rFonts w:ascii="Fairwater Script" w:hAnsi="Fairwater Script"/>
+          <w:color w:val="8B0000"/>
+        </w:rPr>
+        <w:t xml:space="preserve"> What do you call a feud between two of Genghis Khan’s generals?</w:t>
+      </w:r>
+      <w:r>
+        <w:rPr>
+          <w:rFonts w:ascii="Fairwater Script" w:hAnsi="Fairwater Script"/>
+          <w:color w:val="8B0000"/>
+        </w:rPr>
+        <w:br/>
+      </w:r>
+    </w:p>
+    <w:p>
+      <w:pPr>
+        <w:jc w:val="center"/>
+        <w:rPr>
+          <w:rFonts w:ascii="Fairwater Script" w:hAnsi="Fairwater Script"/>
+          <w:color w:val="8B0000"/>
+        </w:rPr>
+      </w:pPr>
+      <w:r>
+        <w:rPr>
+          <w:rFonts w:ascii="Fairwater Script" w:hAnsi="Fairwater Script"/>
+          <w:color w:val="8B0000"/>
+        </w:rPr>
+        <w:t>Mongolian beef.</w:t>
       </w:r>
     </w:p>
     <w:sectPr>
@@ -1625,7 +2216,7 @@
   <w:style w:type="paragraph" w:default="1" w:styleId="Normal">
     <w:name w:val="Normal"/>
     <w:qFormat/>
-    <w:rsid w:val="00707FB2"/>
+    <w:rsid w:val="00532D49"/>
   </w:style>
   <w:style w:type="paragraph" w:styleId="Heading1">
     <w:name w:val="heading 1"/>

</xml_diff>